<commit_message>
Blood Donation Finder Project Proposal  - Group 7
</commit_message>
<xml_diff>
--- a/Blood Donation Finder Project Proposal.docx
+++ b/Blood Donation Finder Project Proposal.docx
@@ -1,6 +1,6 @@
 
 <file path=word/document.xml><?xml version="1.0" encoding="utf-8"?>
-<w:document xmlns:wpc="http://schemas.microsoft.com/office/word/2010/wordprocessingCanvas" xmlns:cx="http://schemas.microsoft.com/office/drawing/2014/chartex" xmlns:cx1="http://schemas.microsoft.com/office/drawing/2015/9/8/chartex" xmlns:cx2="http://schemas.microsoft.com/office/drawing/2015/10/21/chartex" xmlns:cx3="http://schemas.microsoft.com/office/drawing/2016/5/9/chartex" xmlns:cx4="http://schemas.microsoft.com/office/drawing/2016/5/10/chartex" xmlns:cx5="http://schemas.microsoft.com/office/drawing/2016/5/11/chartex" xmlns:cx6="http://schemas.microsoft.com/office/drawing/2016/5/12/chartex" xmlns:cx7="http://schemas.microsoft.com/office/drawing/2016/5/13/chartex" xmlns:cx8="http://schemas.microsoft.com/office/drawing/2016/5/14/chartex" xmlns:mc="http://schemas.openxmlformats.org/markup-compatibility/2006" xmlns:aink="http://schemas.microsoft.com/office/drawing/2016/ink" xmlns:am3d="http://schemas.microsoft.com/office/drawing/2017/model3d" xmlns:o="urn:schemas-microsoft-com:office:office" xmlns:r="http://schemas.openxmlformats.org/officeDocument/2006/relationships" xmlns:m="http://schemas.openxmlformats.org/officeDocument/2006/math" xmlns:v="urn:schemas-microsoft-com:vml" xmlns:wp14="http://schemas.microsoft.com/office/word/2010/wordprocessingDrawing" xmlns:wp="http://schemas.openxmlformats.org/drawingml/2006/wordprocessingDrawing" xmlns:w10="urn:schemas-microsoft-com:office:word" xmlns:w="http://schemas.openxmlformats.org/wordprocessingml/2006/main" xmlns:w14="http://schemas.microsoft.com/office/word/2010/wordml" xmlns:w15="http://schemas.microsoft.com/office/word/2012/wordml" xmlns:w16cex="http://schemas.microsoft.com/office/word/2018/wordml/cex" xmlns:w16cid="http://schemas.microsoft.com/office/word/2016/wordml/cid" xmlns:w16="http://schemas.microsoft.com/office/word/2018/wordml" xmlns:w16sdtdh="http://schemas.microsoft.com/office/word/2020/wordml/sdtdatahash" xmlns:w16se="http://schemas.microsoft.com/office/word/2015/wordml/symex" xmlns:wpg="http://schemas.microsoft.com/office/word/2010/wordprocessingGroup" xmlns:wpi="http://schemas.microsoft.com/office/word/2010/wordprocessingInk" xmlns:wne="http://schemas.microsoft.com/office/word/2006/wordml" xmlns:wps="http://schemas.microsoft.com/office/word/2010/wordprocessingShape" mc:Ignorable="w14 w15 w16se w16cid w16 w16cex w16sdtdh wp14">
+<w:document xmlns:wpc="http://schemas.microsoft.com/office/word/2010/wordprocessingCanvas" xmlns:cx="http://schemas.microsoft.com/office/drawing/2014/chartex" xmlns:cx1="http://schemas.microsoft.com/office/drawing/2015/9/8/chartex" xmlns:cx2="http://schemas.microsoft.com/office/drawing/2015/10/21/chartex" xmlns:cx3="http://schemas.microsoft.com/office/drawing/2016/5/9/chartex" xmlns:cx4="http://schemas.microsoft.com/office/drawing/2016/5/10/chartex" xmlns:cx5="http://schemas.microsoft.com/office/drawing/2016/5/11/chartex" xmlns:cx6="http://schemas.microsoft.com/office/drawing/2016/5/12/chartex" xmlns:cx7="http://schemas.microsoft.com/office/drawing/2016/5/13/chartex" xmlns:cx8="http://schemas.microsoft.com/office/drawing/2016/5/14/chartex" xmlns:mc="http://schemas.openxmlformats.org/markup-compatibility/2006" xmlns:aink="http://schemas.microsoft.com/office/drawing/2016/ink" xmlns:am3d="http://schemas.microsoft.com/office/drawing/2017/model3d" xmlns:o="urn:schemas-microsoft-com:office:office" xmlns:oel="http://schemas.microsoft.com/office/2019/extlst" xmlns:r="http://schemas.openxmlformats.org/officeDocument/2006/relationships" xmlns:m="http://schemas.openxmlformats.org/officeDocument/2006/math" xmlns:v="urn:schemas-microsoft-com:vml" xmlns:wp14="http://schemas.microsoft.com/office/word/2010/wordprocessingDrawing" xmlns:wp="http://schemas.openxmlformats.org/drawingml/2006/wordprocessingDrawing" xmlns:w10="urn:schemas-microsoft-com:office:word" xmlns:w="http://schemas.openxmlformats.org/wordprocessingml/2006/main" xmlns:w14="http://schemas.microsoft.com/office/word/2010/wordml" xmlns:w15="http://schemas.microsoft.com/office/word/2012/wordml" xmlns:w16cex="http://schemas.microsoft.com/office/word/2018/wordml/cex" xmlns:w16cid="http://schemas.microsoft.com/office/word/2016/wordml/cid" xmlns:w16="http://schemas.microsoft.com/office/word/2018/wordml" xmlns:w16sdtdh="http://schemas.microsoft.com/office/word/2020/wordml/sdtdatahash" xmlns:w16se="http://schemas.microsoft.com/office/word/2015/wordml/symex" xmlns:wpg="http://schemas.microsoft.com/office/word/2010/wordprocessingGroup" xmlns:wpi="http://schemas.microsoft.com/office/word/2010/wordprocessingInk" xmlns:wne="http://schemas.microsoft.com/office/word/2006/wordml" xmlns:wps="http://schemas.microsoft.com/office/word/2010/wordprocessingShape" mc:Ignorable="w14 w15 w16se w16cid w16 w16cex w16sdtdh wp14">
   <w:body>
     <w:p>
       <w:pPr>
@@ -153,17 +153,22 @@
           <w:rFonts w:ascii="Times New Roman" w:hAnsi="Times New Roman" w:cs="Times New Roman"/>
           <w:color w:val="000000" w:themeColor="text1"/>
         </w:rPr>
-        <w:t xml:space="preserve">Dipesh </w:t>
-      </w:r>
-      <w:proofErr w:type="spellStart"/>
-      <w:r>
-        <w:rPr>
-          <w:rFonts w:ascii="Times New Roman" w:hAnsi="Times New Roman" w:cs="Times New Roman"/>
-          <w:color w:val="000000" w:themeColor="text1"/>
-        </w:rPr>
-        <w:t>Bastola</w:t>
-      </w:r>
-      <w:proofErr w:type="spellEnd"/>
+        <w:t>D</w:t>
+      </w:r>
+      <w:r>
+        <w:rPr>
+          <w:rFonts w:ascii="Times New Roman" w:hAnsi="Times New Roman" w:cs="Times New Roman"/>
+          <w:color w:val="000000" w:themeColor="text1"/>
+        </w:rPr>
+        <w:t>ee</w:t>
+      </w:r>
+      <w:r>
+        <w:rPr>
+          <w:rFonts w:ascii="Times New Roman" w:hAnsi="Times New Roman" w:cs="Times New Roman"/>
+          <w:color w:val="000000" w:themeColor="text1"/>
+        </w:rPr>
+        <w:t>pesh Bastola</w:t>
+      </w:r>
     </w:p>
     <w:p>
       <w:pPr>
@@ -269,8 +274,8 @@
       </w:r>
       <w:bookmarkStart w:id="0" w:name="_Toc229922887"/>
     </w:p>
-    <w:bookmarkStart w:id="1" w:name="_Toc229923051" w:displacedByCustomXml="next"/>
-    <w:bookmarkStart w:id="2" w:name="_Toc229923291" w:displacedByCustomXml="next"/>
+    <w:bookmarkStart w:id="1" w:name="_Toc229923291" w:displacedByCustomXml="next"/>
+    <w:bookmarkStart w:id="2" w:name="_Toc229923051" w:displacedByCustomXml="next"/>
     <w:sdt>
       <w:sdtPr>
         <w:rPr>
@@ -2611,6 +2616,7 @@
           <w:bCs/>
           <w:color w:val="000000" w:themeColor="text1"/>
         </w:rPr>
+        <w:lastRenderedPageBreak/>
         <w:t>INTRODUCTION</w:t>
       </w:r>
       <w:bookmarkEnd w:id="0"/>
@@ -2897,6 +2903,7 @@
           <w:bCs/>
           <w:color w:val="000000" w:themeColor="text1"/>
         </w:rPr>
+        <w:lastRenderedPageBreak/>
         <w:t>PROBLEM STATEMENT</w:t>
       </w:r>
       <w:bookmarkEnd w:id="20"/>
@@ -3209,6 +3216,7 @@
           <w:sz w:val="28"/>
           <w:szCs w:val="28"/>
         </w:rPr>
+        <w:lastRenderedPageBreak/>
         <w:t>Who is Affected</w:t>
       </w:r>
       <w:bookmarkEnd w:id="30"/>
@@ -3584,6 +3592,7 @@
           <w:sz w:val="24"/>
           <w:szCs w:val="24"/>
         </w:rPr>
+        <w:lastRenderedPageBreak/>
         <w:t>Maintain a structured donor database using MySQL that ensures data integrity, security, and efficient query performance.</w:t>
       </w:r>
     </w:p>
@@ -3985,6 +3994,7 @@
           <w:sz w:val="24"/>
           <w:szCs w:val="24"/>
         </w:rPr>
+        <w:lastRenderedPageBreak/>
         <w:t>System Administrators: Need tools to oversee platform operations, manage users, and ensure data integrity.</w:t>
       </w:r>
     </w:p>
@@ -4302,6 +4312,7 @@
           <w:sz w:val="28"/>
           <w:szCs w:val="28"/>
         </w:rPr>
+        <w:lastRenderedPageBreak/>
         <w:t>High-Level Design</w:t>
       </w:r>
       <w:bookmarkEnd w:id="90"/>
@@ -4844,6 +4855,7 @@
           <w:bCs/>
           <w:color w:val="000000" w:themeColor="text1"/>
         </w:rPr>
+        <w:lastRenderedPageBreak/>
         <w:t>Working Mechanism</w:t>
       </w:r>
       <w:bookmarkEnd w:id="103"/>
@@ -4941,6 +4953,7 @@
           <w:sz w:val="24"/>
           <w:szCs w:val="24"/>
         </w:rPr>
+        <w:lastRenderedPageBreak/>
         <w:drawing>
           <wp:anchor distT="0" distB="0" distL="114300" distR="114300" simplePos="0" relativeHeight="251659264" behindDoc="0" locked="0" layoutInCell="1" allowOverlap="1" wp14:anchorId="141A5133" wp14:editId="7D32D3BA">
             <wp:simplePos x="0" y="0"/>
@@ -5270,6 +5283,7 @@
         <w:rPr>
           <w:noProof/>
         </w:rPr>
+        <w:lastRenderedPageBreak/>
         <w:drawing>
           <wp:anchor distT="0" distB="0" distL="114300" distR="114300" simplePos="0" relativeHeight="251660288" behindDoc="0" locked="0" layoutInCell="1" allowOverlap="1" wp14:anchorId="7CE0618C" wp14:editId="0FA78A68">
             <wp:simplePos x="0" y="0"/>
@@ -5504,6 +5518,7 @@
           <w:color w:val="4472C4" w:themeColor="accent1"/>
           <w:u w:val="single"/>
         </w:rPr>
+        <w:lastRenderedPageBreak/>
         <w:drawing>
           <wp:anchor distT="0" distB="0" distL="114300" distR="114300" simplePos="0" relativeHeight="251661312" behindDoc="0" locked="0" layoutInCell="1" allowOverlap="1" wp14:anchorId="620A8C26" wp14:editId="23F8986E">
             <wp:simplePos x="0" y="0"/>
@@ -5953,6 +5968,7 @@
           <w:bCs/>
           <w:color w:val="000000" w:themeColor="text1"/>
         </w:rPr>
+        <w:lastRenderedPageBreak/>
         <w:t>GANTT CHART</w:t>
       </w:r>
       <w:bookmarkEnd w:id="112"/>
@@ -6331,6 +6347,7 @@
           <w:sz w:val="28"/>
           <w:szCs w:val="28"/>
         </w:rPr>
+        <w:lastRenderedPageBreak/>
         <w:t>Phase Summary</w:t>
       </w:r>
       <w:bookmarkEnd w:id="124"/>
@@ -6659,6 +6676,7 @@
           <w:bCs/>
           <w:color w:val="000000" w:themeColor="text1"/>
         </w:rPr>
+        <w:lastRenderedPageBreak/>
         <w:t>EXPECTED OUTCOME</w:t>
       </w:r>
       <w:bookmarkEnd w:id="129"/>
@@ -7037,6 +7055,7 @@
           <w:sz w:val="24"/>
           <w:szCs w:val="24"/>
         </w:rPr>
+        <w:lastRenderedPageBreak/>
         <w:t>The project demonstrates the practical application of modern web technologies in solving real-world public health challenges and serves as a scalable model that can be expanded to other regions or integrated with national blood bank systems in the future.</w:t>
       </w:r>
     </w:p>
@@ -7083,6 +7102,7 @@
           <w:bCs/>
           <w:color w:val="000000" w:themeColor="text1"/>
         </w:rPr>
+        <w:lastRenderedPageBreak/>
         <w:t>REFERENCES</w:t>
       </w:r>
       <w:bookmarkEnd w:id="144"/>
@@ -7414,7 +7434,7 @@
 </file>
 
 <file path=word/endnotes.xml><?xml version="1.0" encoding="utf-8"?>
-<w:endnotes xmlns:wpc="http://schemas.microsoft.com/office/word/2010/wordprocessingCanvas" xmlns:cx="http://schemas.microsoft.com/office/drawing/2014/chartex" xmlns:cx1="http://schemas.microsoft.com/office/drawing/2015/9/8/chartex" xmlns:cx2="http://schemas.microsoft.com/office/drawing/2015/10/21/chartex" xmlns:cx3="http://schemas.microsoft.com/office/drawing/2016/5/9/chartex" xmlns:cx4="http://schemas.microsoft.com/office/drawing/2016/5/10/chartex" xmlns:cx5="http://schemas.microsoft.com/office/drawing/2016/5/11/chartex" xmlns:cx6="http://schemas.microsoft.com/office/drawing/2016/5/12/chartex" xmlns:cx7="http://schemas.microsoft.com/office/drawing/2016/5/13/chartex" xmlns:cx8="http://schemas.microsoft.com/office/drawing/2016/5/14/chartex" xmlns:mc="http://schemas.openxmlformats.org/markup-compatibility/2006" xmlns:aink="http://schemas.microsoft.com/office/drawing/2016/ink" xmlns:am3d="http://schemas.microsoft.com/office/drawing/2017/model3d" xmlns:o="urn:schemas-microsoft-com:office:office" xmlns:r="http://schemas.openxmlformats.org/officeDocument/2006/relationships" xmlns:m="http://schemas.openxmlformats.org/officeDocument/2006/math" xmlns:v="urn:schemas-microsoft-com:vml" xmlns:wp14="http://schemas.microsoft.com/office/word/2010/wordprocessingDrawing" xmlns:wp="http://schemas.openxmlformats.org/drawingml/2006/wordprocessingDrawing" xmlns:w10="urn:schemas-microsoft-com:office:word" xmlns:w="http://schemas.openxmlformats.org/wordprocessingml/2006/main" xmlns:w14="http://schemas.microsoft.com/office/word/2010/wordml" xmlns:w15="http://schemas.microsoft.com/office/word/2012/wordml" xmlns:w16cex="http://schemas.microsoft.com/office/word/2018/wordml/cex" xmlns:w16cid="http://schemas.microsoft.com/office/word/2016/wordml/cid" xmlns:w16="http://schemas.microsoft.com/office/word/2018/wordml" xmlns:w16sdtdh="http://schemas.microsoft.com/office/word/2020/wordml/sdtdatahash" xmlns:w16se="http://schemas.microsoft.com/office/word/2015/wordml/symex" xmlns:wpg="http://schemas.microsoft.com/office/word/2010/wordprocessingGroup" xmlns:wpi="http://schemas.microsoft.com/office/word/2010/wordprocessingInk" xmlns:wne="http://schemas.microsoft.com/office/word/2006/wordml" xmlns:wps="http://schemas.microsoft.com/office/word/2010/wordprocessingShape" mc:Ignorable="w14 w15 w16se w16cid w16 w16cex w16sdtdh wp14">
+<w:endnotes xmlns:wpc="http://schemas.microsoft.com/office/word/2010/wordprocessingCanvas" xmlns:cx="http://schemas.microsoft.com/office/drawing/2014/chartex" xmlns:cx1="http://schemas.microsoft.com/office/drawing/2015/9/8/chartex" xmlns:cx2="http://schemas.microsoft.com/office/drawing/2015/10/21/chartex" xmlns:cx3="http://schemas.microsoft.com/office/drawing/2016/5/9/chartex" xmlns:cx4="http://schemas.microsoft.com/office/drawing/2016/5/10/chartex" xmlns:cx5="http://schemas.microsoft.com/office/drawing/2016/5/11/chartex" xmlns:cx6="http://schemas.microsoft.com/office/drawing/2016/5/12/chartex" xmlns:cx7="http://schemas.microsoft.com/office/drawing/2016/5/13/chartex" xmlns:cx8="http://schemas.microsoft.com/office/drawing/2016/5/14/chartex" xmlns:mc="http://schemas.openxmlformats.org/markup-compatibility/2006" xmlns:aink="http://schemas.microsoft.com/office/drawing/2016/ink" xmlns:am3d="http://schemas.microsoft.com/office/drawing/2017/model3d" xmlns:o="urn:schemas-microsoft-com:office:office" xmlns:oel="http://schemas.microsoft.com/office/2019/extlst" xmlns:r="http://schemas.openxmlformats.org/officeDocument/2006/relationships" xmlns:m="http://schemas.openxmlformats.org/officeDocument/2006/math" xmlns:v="urn:schemas-microsoft-com:vml" xmlns:wp14="http://schemas.microsoft.com/office/word/2010/wordprocessingDrawing" xmlns:wp="http://schemas.openxmlformats.org/drawingml/2006/wordprocessingDrawing" xmlns:w10="urn:schemas-microsoft-com:office:word" xmlns:w="http://schemas.openxmlformats.org/wordprocessingml/2006/main" xmlns:w14="http://schemas.microsoft.com/office/word/2010/wordml" xmlns:w15="http://schemas.microsoft.com/office/word/2012/wordml" xmlns:w16cex="http://schemas.microsoft.com/office/word/2018/wordml/cex" xmlns:w16cid="http://schemas.microsoft.com/office/word/2016/wordml/cid" xmlns:w16="http://schemas.microsoft.com/office/word/2018/wordml" xmlns:w16sdtdh="http://schemas.microsoft.com/office/word/2020/wordml/sdtdatahash" xmlns:w16se="http://schemas.microsoft.com/office/word/2015/wordml/symex" xmlns:wpg="http://schemas.microsoft.com/office/word/2010/wordprocessingGroup" xmlns:wpi="http://schemas.microsoft.com/office/word/2010/wordprocessingInk" xmlns:wne="http://schemas.microsoft.com/office/word/2006/wordml" xmlns:wps="http://schemas.microsoft.com/office/word/2010/wordprocessingShape" mc:Ignorable="w14 w15 w16se w16cid w16 w16cex w16sdtdh wp14">
   <w:endnote w:type="separator" w:id="-1">
     <w:p>
       <w:r>
@@ -7433,7 +7453,7 @@
 </file>
 
 <file path=word/footnotes.xml><?xml version="1.0" encoding="utf-8"?>
-<w:footnotes xmlns:wpc="http://schemas.microsoft.com/office/word/2010/wordprocessingCanvas" xmlns:cx="http://schemas.microsoft.com/office/drawing/2014/chartex" xmlns:cx1="http://schemas.microsoft.com/office/drawing/2015/9/8/chartex" xmlns:cx2="http://schemas.microsoft.com/office/drawing/2015/10/21/chartex" xmlns:cx3="http://schemas.microsoft.com/office/drawing/2016/5/9/chartex" xmlns:cx4="http://schemas.microsoft.com/office/drawing/2016/5/10/chartex" xmlns:cx5="http://schemas.microsoft.com/office/drawing/2016/5/11/chartex" xmlns:cx6="http://schemas.microsoft.com/office/drawing/2016/5/12/chartex" xmlns:cx7="http://schemas.microsoft.com/office/drawing/2016/5/13/chartex" xmlns:cx8="http://schemas.microsoft.com/office/drawing/2016/5/14/chartex" xmlns:mc="http://schemas.openxmlformats.org/markup-compatibility/2006" xmlns:aink="http://schemas.microsoft.com/office/drawing/2016/ink" xmlns:am3d="http://schemas.microsoft.com/office/drawing/2017/model3d" xmlns:o="urn:schemas-microsoft-com:office:office" xmlns:r="http://schemas.openxmlformats.org/officeDocument/2006/relationships" xmlns:m="http://schemas.openxmlformats.org/officeDocument/2006/math" xmlns:v="urn:schemas-microsoft-com:vml" xmlns:wp14="http://schemas.microsoft.com/office/word/2010/wordprocessingDrawing" xmlns:wp="http://schemas.openxmlformats.org/drawingml/2006/wordprocessingDrawing" xmlns:w10="urn:schemas-microsoft-com:office:word" xmlns:w="http://schemas.openxmlformats.org/wordprocessingml/2006/main" xmlns:w14="http://schemas.microsoft.com/office/word/2010/wordml" xmlns:w15="http://schemas.microsoft.com/office/word/2012/wordml" xmlns:w16cex="http://schemas.microsoft.com/office/word/2018/wordml/cex" xmlns:w16cid="http://schemas.microsoft.com/office/word/2016/wordml/cid" xmlns:w16="http://schemas.microsoft.com/office/word/2018/wordml" xmlns:w16sdtdh="http://schemas.microsoft.com/office/word/2020/wordml/sdtdatahash" xmlns:w16se="http://schemas.microsoft.com/office/word/2015/wordml/symex" xmlns:wpg="http://schemas.microsoft.com/office/word/2010/wordprocessingGroup" xmlns:wpi="http://schemas.microsoft.com/office/word/2010/wordprocessingInk" xmlns:wne="http://schemas.microsoft.com/office/word/2006/wordml" xmlns:wps="http://schemas.microsoft.com/office/word/2010/wordprocessingShape" mc:Ignorable="w14 w15 w16se w16cid w16 w16cex w16sdtdh wp14">
+<w:footnotes xmlns:wpc="http://schemas.microsoft.com/office/word/2010/wordprocessingCanvas" xmlns:cx="http://schemas.microsoft.com/office/drawing/2014/chartex" xmlns:cx1="http://schemas.microsoft.com/office/drawing/2015/9/8/chartex" xmlns:cx2="http://schemas.microsoft.com/office/drawing/2015/10/21/chartex" xmlns:cx3="http://schemas.microsoft.com/office/drawing/2016/5/9/chartex" xmlns:cx4="http://schemas.microsoft.com/office/drawing/2016/5/10/chartex" xmlns:cx5="http://schemas.microsoft.com/office/drawing/2016/5/11/chartex" xmlns:cx6="http://schemas.microsoft.com/office/drawing/2016/5/12/chartex" xmlns:cx7="http://schemas.microsoft.com/office/drawing/2016/5/13/chartex" xmlns:cx8="http://schemas.microsoft.com/office/drawing/2016/5/14/chartex" xmlns:mc="http://schemas.openxmlformats.org/markup-compatibility/2006" xmlns:aink="http://schemas.microsoft.com/office/drawing/2016/ink" xmlns:am3d="http://schemas.microsoft.com/office/drawing/2017/model3d" xmlns:o="urn:schemas-microsoft-com:office:office" xmlns:oel="http://schemas.microsoft.com/office/2019/extlst" xmlns:r="http://schemas.openxmlformats.org/officeDocument/2006/relationships" xmlns:m="http://schemas.openxmlformats.org/officeDocument/2006/math" xmlns:v="urn:schemas-microsoft-com:vml" xmlns:wp14="http://schemas.microsoft.com/office/word/2010/wordprocessingDrawing" xmlns:wp="http://schemas.openxmlformats.org/drawingml/2006/wordprocessingDrawing" xmlns:w10="urn:schemas-microsoft-com:office:word" xmlns:w="http://schemas.openxmlformats.org/wordprocessingml/2006/main" xmlns:w14="http://schemas.microsoft.com/office/word/2010/wordml" xmlns:w15="http://schemas.microsoft.com/office/word/2012/wordml" xmlns:w16cex="http://schemas.microsoft.com/office/word/2018/wordml/cex" xmlns:w16cid="http://schemas.microsoft.com/office/word/2016/wordml/cid" xmlns:w16="http://schemas.microsoft.com/office/word/2018/wordml" xmlns:w16sdtdh="http://schemas.microsoft.com/office/word/2020/wordml/sdtdatahash" xmlns:w16se="http://schemas.microsoft.com/office/word/2015/wordml/symex" xmlns:wpg="http://schemas.microsoft.com/office/word/2010/wordprocessingGroup" xmlns:wpi="http://schemas.microsoft.com/office/word/2010/wordprocessingInk" xmlns:wne="http://schemas.microsoft.com/office/word/2006/wordml" xmlns:wps="http://schemas.microsoft.com/office/word/2010/wordprocessingShape" mc:Ignorable="w14 w15 w16se w16cid w16 w16cex w16sdtdh wp14">
   <w:footnote w:type="separator" w:id="-1">
     <w:p>
       <w:r>
@@ -7452,7 +7472,7 @@
 </file>
 
 <file path=word/numbering.xml><?xml version="1.0" encoding="utf-8"?>
-<w:numbering xmlns:wpc="http://schemas.microsoft.com/office/word/2010/wordprocessingCanvas" xmlns:cx="http://schemas.microsoft.com/office/drawing/2014/chartex" xmlns:cx1="http://schemas.microsoft.com/office/drawing/2015/9/8/chartex" xmlns:cx2="http://schemas.microsoft.com/office/drawing/2015/10/21/chartex" xmlns:cx3="http://schemas.microsoft.com/office/drawing/2016/5/9/chartex" xmlns:cx4="http://schemas.microsoft.com/office/drawing/2016/5/10/chartex" xmlns:cx5="http://schemas.microsoft.com/office/drawing/2016/5/11/chartex" xmlns:cx6="http://schemas.microsoft.com/office/drawing/2016/5/12/chartex" xmlns:cx7="http://schemas.microsoft.com/office/drawing/2016/5/13/chartex" xmlns:cx8="http://schemas.microsoft.com/office/drawing/2016/5/14/chartex" xmlns:mc="http://schemas.openxmlformats.org/markup-compatibility/2006" xmlns:aink="http://schemas.microsoft.com/office/drawing/2016/ink" xmlns:am3d="http://schemas.microsoft.com/office/drawing/2017/model3d" xmlns:o="urn:schemas-microsoft-com:office:office" xmlns:r="http://schemas.openxmlformats.org/officeDocument/2006/relationships" xmlns:m="http://schemas.openxmlformats.org/officeDocument/2006/math" xmlns:v="urn:schemas-microsoft-com:vml" xmlns:wp14="http://schemas.microsoft.com/office/word/2010/wordprocessingDrawing" xmlns:wp="http://schemas.openxmlformats.org/drawingml/2006/wordprocessingDrawing" xmlns:w10="urn:schemas-microsoft-com:office:word" xmlns:w="http://schemas.openxmlformats.org/wordprocessingml/2006/main" xmlns:w14="http://schemas.microsoft.com/office/word/2010/wordml" xmlns:w15="http://schemas.microsoft.com/office/word/2012/wordml" xmlns:w16cex="http://schemas.microsoft.com/office/word/2018/wordml/cex" xmlns:w16cid="http://schemas.microsoft.com/office/word/2016/wordml/cid" xmlns:w16="http://schemas.microsoft.com/office/word/2018/wordml" xmlns:w16sdtdh="http://schemas.microsoft.com/office/word/2020/wordml/sdtdatahash" xmlns:w16se="http://schemas.microsoft.com/office/word/2015/wordml/symex" xmlns:wpg="http://schemas.microsoft.com/office/word/2010/wordprocessingGroup" xmlns:wpi="http://schemas.microsoft.com/office/word/2010/wordprocessingInk" xmlns:wne="http://schemas.microsoft.com/office/word/2006/wordml" xmlns:wps="http://schemas.microsoft.com/office/word/2010/wordprocessingShape" mc:Ignorable="w14 w15 w16se w16cid w16 w16cex w16sdtdh wp14">
+<w:numbering xmlns:wpc="http://schemas.microsoft.com/office/word/2010/wordprocessingCanvas" xmlns:cx="http://schemas.microsoft.com/office/drawing/2014/chartex" xmlns:cx1="http://schemas.microsoft.com/office/drawing/2015/9/8/chartex" xmlns:cx2="http://schemas.microsoft.com/office/drawing/2015/10/21/chartex" xmlns:cx3="http://schemas.microsoft.com/office/drawing/2016/5/9/chartex" xmlns:cx4="http://schemas.microsoft.com/office/drawing/2016/5/10/chartex" xmlns:cx5="http://schemas.microsoft.com/office/drawing/2016/5/11/chartex" xmlns:cx6="http://schemas.microsoft.com/office/drawing/2016/5/12/chartex" xmlns:cx7="http://schemas.microsoft.com/office/drawing/2016/5/13/chartex" xmlns:cx8="http://schemas.microsoft.com/office/drawing/2016/5/14/chartex" xmlns:mc="http://schemas.openxmlformats.org/markup-compatibility/2006" xmlns:aink="http://schemas.microsoft.com/office/drawing/2016/ink" xmlns:am3d="http://schemas.microsoft.com/office/drawing/2017/model3d" xmlns:o="urn:schemas-microsoft-com:office:office" xmlns:oel="http://schemas.microsoft.com/office/2019/extlst" xmlns:r="http://schemas.openxmlformats.org/officeDocument/2006/relationships" xmlns:m="http://schemas.openxmlformats.org/officeDocument/2006/math" xmlns:v="urn:schemas-microsoft-com:vml" xmlns:wp14="http://schemas.microsoft.com/office/word/2010/wordprocessingDrawing" xmlns:wp="http://schemas.openxmlformats.org/drawingml/2006/wordprocessingDrawing" xmlns:w10="urn:schemas-microsoft-com:office:word" xmlns:w="http://schemas.openxmlformats.org/wordprocessingml/2006/main" xmlns:w14="http://schemas.microsoft.com/office/word/2010/wordml" xmlns:w15="http://schemas.microsoft.com/office/word/2012/wordml" xmlns:w16cex="http://schemas.microsoft.com/office/word/2018/wordml/cex" xmlns:w16cid="http://schemas.microsoft.com/office/word/2016/wordml/cid" xmlns:w16="http://schemas.microsoft.com/office/word/2018/wordml" xmlns:w16sdtdh="http://schemas.microsoft.com/office/word/2020/wordml/sdtdatahash" xmlns:w16se="http://schemas.microsoft.com/office/word/2015/wordml/symex" xmlns:wpg="http://schemas.microsoft.com/office/word/2010/wordprocessingGroup" xmlns:wpi="http://schemas.microsoft.com/office/word/2010/wordprocessingInk" xmlns:wne="http://schemas.microsoft.com/office/word/2006/wordml" xmlns:wps="http://schemas.microsoft.com/office/word/2010/wordprocessingShape" mc:Ignorable="w14 w15 w16se w16cid w16 w16cex w16sdtdh wp14">
   <w:abstractNum w:abstractNumId="0" w15:restartNumberingAfterBreak="0">
     <w:nsid w:val="4D546649"/>
     <w:multiLevelType w:val="hybridMultilevel"/>
@@ -7561,13 +7581,13 @@
       <w:lvlJc w:val="left"/>
     </w:lvl>
   </w:abstractNum>
-  <w:num w:numId="1">
+  <w:num w:numId="1" w16cid:durableId="1834301231">
     <w:abstractNumId w:val="0"/>
     <w:lvlOverride w:ilvl="0">
       <w:startOverride w:val="1"/>
     </w:lvlOverride>
   </w:num>
-  <w:num w:numId="2">
+  <w:num w:numId="2" w16cid:durableId="29185865">
     <w:abstractNumId w:val="1"/>
     <w:lvlOverride w:ilvl="0">
       <w:startOverride w:val="1"/>

</xml_diff>